<commit_message>
docs: comprehensive documentation update — all undocumented features added
New content added:
- Dark/Light Mode toggle (usage guide 5.8 + FAQ + strength section)
- Font size adjustment buttons (A+/A-) in usage guide 5.8
- Data file comparison feature in usage guide 5.3 + strength section
- Excel export from WORKSPACE in usage guide 5.3 + strength section
- Education templates 1-click (exam results & attendance) in 5.3
- Chart Q&A (ask questions about generated charts) in 5.3
- Quick agent navigation pills in KPM Support (5.7 step 7)
- Email sending step in Official Letter Generator (5.5 step 9)
- DELIMa added to supported systems list in 5.7
- Sejarah Pengemaskinian updated with items 7-11
- Section 3 weakness: chart language bug marked [SELESAI]
- Section 4.3 BM/EN translation cadangan marked as partly done

Co-Authored-By: Claude Sonnet 4.6 <noreply@anthropic.com>
</commit_message>
<xml_diff>
--- a/SMARTAssist_Hub_V7_Dokumentasi.docx
+++ b/SMARTAssist_Hub_V7_Dokumentasi.docx
@@ -2715,63 +2715,63 @@
               <w:rPr>
                 <w:sz w:val="20"/>
               </w:rPr>
-              <w:t>Analisis fail CSV/Excel, jana carta dan statistik secara automatik. Eksport slaid PowerPoint dengan pilihan kandungan.</w:t>
-            </w:r>
-            <w:proofErr w:type="spellEnd"/>
-            <w:r>
-              <w:rPr>
-                <w:sz w:val="20"/>
-              </w:rPr>
-              <w:t>Analisis fail CSV/Excel, jana carta dan statistik secara automatik. Eksport slaid PowerPoint dengan pilihan kandungan.</w:t>
-            </w:r>
-            <w:proofErr w:type="spellStart"/>
-            <w:r>
-              <w:rPr>
-                <w:sz w:val="20"/>
-              </w:rPr>
-              <w:t>Analisis fail CSV/Excel, jana carta dan statistik secara automatik. Eksport slaid PowerPoint dengan pilihan kandungan.</w:t>
-            </w:r>
-            <w:proofErr w:type="spellEnd"/>
-            <w:r>
-              <w:rPr>
-                <w:sz w:val="20"/>
-              </w:rPr>
-              <w:t>Analisis fail CSV/Excel, jana carta dan statistik secara automatik. Eksport slaid PowerPoint dengan pilihan kandungan.</w:t>
-            </w:r>
-            <w:proofErr w:type="spellStart"/>
-            <w:r>
-              <w:rPr>
-                <w:sz w:val="20"/>
-              </w:rPr>
-              <w:t>Analisis fail CSV/Excel, jana carta dan statistik secara automatik. Eksport slaid PowerPoint dengan pilihan kandungan.</w:t>
-            </w:r>
-            <w:proofErr w:type="spellEnd"/>
-            <w:r>
-              <w:rPr>
-                <w:sz w:val="20"/>
-              </w:rPr>
-              <w:t>Analisis fail CSV/Excel, jana carta dan statistik secara automatik. Eksport slaid PowerPoint dengan pilihan kandungan.</w:t>
-            </w:r>
-            <w:proofErr w:type="spellStart"/>
-            <w:r>
-              <w:rPr>
-                <w:sz w:val="20"/>
-              </w:rPr>
-              <w:t>Analisis fail CSV/Excel, jana carta dan statistik secara automatik. Eksport slaid PowerPoint dengan pilihan kandungan.</w:t>
-            </w:r>
-            <w:proofErr w:type="spellEnd"/>
-            <w:r>
-              <w:rPr>
-                <w:sz w:val="20"/>
-              </w:rPr>
-              <w:t>Analisis fail CSV/Excel, jana carta dan statistik secara automatik. Eksport slaid PowerPoint dengan pilihan kandungan.</w:t>
-            </w:r>
-            <w:proofErr w:type="spellStart"/>
-            <w:r>
-              <w:rPr>
-                <w:sz w:val="20"/>
-              </w:rPr>
-              <w:t>Analisis fail CSV/Excel, jana carta dan statistik secara automatik. Eksport slaid PowerPoint dengan pilihan kandungan.</w:t>
+              <w:t>Analisis fail CSV/Excel, jana carta interaktif, statistik, dan eksport ke PowerPoint atau Excel. Sokong perbandingan dua fail dan templat pendidikan 1-klik.</w:t>
+            </w:r>
+            <w:proofErr w:type="spellEnd"/>
+            <w:r>
+              <w:rPr>
+                <w:sz w:val="20"/>
+              </w:rPr>
+              <w:t>Analisis fail CSV/Excel, jana carta interaktif, statistik, dan eksport ke PowerPoint atau Excel. Sokong perbandingan dua fail dan templat pendidikan 1-klik.</w:t>
+            </w:r>
+            <w:proofErr w:type="spellStart"/>
+            <w:r>
+              <w:rPr>
+                <w:sz w:val="20"/>
+              </w:rPr>
+              <w:t>Analisis fail CSV/Excel, jana carta interaktif, statistik, dan eksport ke PowerPoint atau Excel. Sokong perbandingan dua fail dan templat pendidikan 1-klik.</w:t>
+            </w:r>
+            <w:proofErr w:type="spellEnd"/>
+            <w:r>
+              <w:rPr>
+                <w:sz w:val="20"/>
+              </w:rPr>
+              <w:t>Analisis fail CSV/Excel, jana carta interaktif, statistik, dan eksport ke PowerPoint atau Excel. Sokong perbandingan dua fail dan templat pendidikan 1-klik.</w:t>
+            </w:r>
+            <w:proofErr w:type="spellStart"/>
+            <w:r>
+              <w:rPr>
+                <w:sz w:val="20"/>
+              </w:rPr>
+              <w:t>Analisis fail CSV/Excel, jana carta interaktif, statistik, dan eksport ke PowerPoint atau Excel. Sokong perbandingan dua fail dan templat pendidikan 1-klik.</w:t>
+            </w:r>
+            <w:proofErr w:type="spellEnd"/>
+            <w:r>
+              <w:rPr>
+                <w:sz w:val="20"/>
+              </w:rPr>
+              <w:t>Analisis fail CSV/Excel, jana carta interaktif, statistik, dan eksport ke PowerPoint atau Excel. Sokong perbandingan dua fail dan templat pendidikan 1-klik.</w:t>
+            </w:r>
+            <w:proofErr w:type="spellStart"/>
+            <w:r>
+              <w:rPr>
+                <w:sz w:val="20"/>
+              </w:rPr>
+              <w:t>Analisis fail CSV/Excel, jana carta interaktif, statistik, dan eksport ke PowerPoint atau Excel. Sokong perbandingan dua fail dan templat pendidikan 1-klik.</w:t>
+            </w:r>
+            <w:proofErr w:type="spellEnd"/>
+            <w:r>
+              <w:rPr>
+                <w:sz w:val="20"/>
+              </w:rPr>
+              <w:t>Analisis fail CSV/Excel, jana carta interaktif, statistik, dan eksport ke PowerPoint atau Excel. Sokong perbandingan dua fail dan templat pendidikan 1-klik.</w:t>
+            </w:r>
+            <w:proofErr w:type="spellStart"/>
+            <w:r>
+              <w:rPr>
+                <w:sz w:val="20"/>
+              </w:rPr>
+              <w:t>Analisis fail CSV/Excel, jana carta interaktif, statistik, dan eksport ke PowerPoint atau Excel. Sokong perbandingan dua fail dan templat pendidikan 1-klik.</w:t>
             </w:r>
             <w:proofErr w:type="spellEnd"/>
           </w:p>
@@ -6708,6 +6708,22 @@
       </w:r>
     </w:p>
     <w:p>
+      <w:r>
+        <w:rPr>
+          <w:b w:val="0"/>
+        </w:rPr>
+        <w:t>Mod Gelap/Cerah (Dark/Light Mode): Pengguna boleh menukar tema antara muka antara mod gelap (dark) dan mod cerah (light) menggunakan butang togol di bar navigasi. Pilihan tema disimpan secara automatik.</w:t>
+      </w:r>
+    </w:p>
+    <w:p>
+      <w:r>
+        <w:rPr>
+          <w:b w:val="0"/>
+        </w:rPr>
+        <w:t>Pelarasan Saiz Fon: Butang A+ dan A- membolehkan pengguna melaraskan saiz teks dalam ruang perbualan mengikut keutamaan, berguna untuk paparan pada skrin kecil atau besar.</w:t>
+      </w:r>
+    </w:p>
+    <w:p>
       <w:pPr>
         <w:spacing w:before="200" w:after="80"/>
       </w:pPr>
@@ -8024,6 +8040,22 @@
       </w:r>
     </w:p>
     <w:p>
+      <w:r>
+        <w:rPr>
+          <w:b w:val="0"/>
+        </w:rPr>
+        <w:t>Eksport Excel: Pengguna boleh mengeksport data yang telah dianalisis terus ke dalam fail Microsoft Excel (.xlsx) dengan satu klik dari panel WORKSPACE.</w:t>
+      </w:r>
+    </w:p>
+    <w:p>
+      <w:r>
+        <w:rPr>
+          <w:b w:val="0"/>
+        </w:rPr>
+        <w:t>Perbandingan Dua Fail Data: Modul Data Analysis menyokong muat naik dua fail CSV/Excel serentak untuk perbandingan terus antara dua set data, memudahkan analisis perubahan dari semasa ke semasa.</w:t>
+      </w:r>
+    </w:p>
+    <w:p>
       <w:pPr>
         <w:shd w:val="clear" w:color="auto" w:fill="EBF5FF"/>
         <w:spacing w:after="80"/>
@@ -8983,7 +9015,7 @@
                 <w:color w:val="C53030"/>
                 <w:sz w:val="20"/>
               </w:rPr>
-              <w:t>📊 Carta Tidak Kemaskini Bila Tukar Bahasa</w:t>
+              <w:t>[SELESAI] Label carta dan elemen UI dikemaskini sepenuhnya apabila bahasa ditukar (diperbetulkan v7.0)</w:t>
             </w:r>
           </w:p>
         </w:tc>
@@ -9000,259 +9032,259 @@
               <w:rPr>
                 <w:sz w:val="20"/>
               </w:rPr>
-              <w:t xml:space="preserve">Label carta </w:t>
-            </w:r>
-            <w:proofErr w:type="spellStart"/>
-            <w:r>
-              <w:rPr>
-                <w:sz w:val="20"/>
-              </w:rPr>
-              <w:t>dalam</w:t>
-            </w:r>
-            <w:proofErr w:type="spellEnd"/>
-            <w:r>
-              <w:rPr>
-                <w:sz w:val="20"/>
-              </w:rPr>
-              <w:t xml:space="preserve"> Papan </w:t>
-            </w:r>
-            <w:proofErr w:type="spellStart"/>
-            <w:r>
-              <w:rPr>
-                <w:sz w:val="20"/>
-              </w:rPr>
-              <w:t>Pemuka</w:t>
-            </w:r>
-            <w:proofErr w:type="spellEnd"/>
-            <w:r>
-              <w:rPr>
-                <w:sz w:val="20"/>
-              </w:rPr>
-              <w:t xml:space="preserve"> </w:t>
-            </w:r>
-            <w:proofErr w:type="spellStart"/>
-            <w:r>
-              <w:rPr>
-                <w:sz w:val="20"/>
-              </w:rPr>
-              <w:t>Analitik</w:t>
-            </w:r>
-            <w:proofErr w:type="spellEnd"/>
-            <w:r>
-              <w:rPr>
-                <w:sz w:val="20"/>
-              </w:rPr>
-              <w:t xml:space="preserve"> </w:t>
-            </w:r>
-            <w:proofErr w:type="spellStart"/>
-            <w:r>
-              <w:rPr>
-                <w:sz w:val="20"/>
-              </w:rPr>
-              <w:t>tidak</w:t>
-            </w:r>
-            <w:proofErr w:type="spellEnd"/>
-            <w:r>
-              <w:rPr>
-                <w:sz w:val="20"/>
-              </w:rPr>
-              <w:t xml:space="preserve"> </w:t>
-            </w:r>
-            <w:proofErr w:type="spellStart"/>
-            <w:r>
-              <w:rPr>
-                <w:sz w:val="20"/>
-              </w:rPr>
-              <w:t>dikemaskini</w:t>
-            </w:r>
-            <w:proofErr w:type="spellEnd"/>
-            <w:r>
-              <w:rPr>
-                <w:sz w:val="20"/>
-              </w:rPr>
-              <w:t xml:space="preserve"> </w:t>
-            </w:r>
-            <w:proofErr w:type="spellStart"/>
-            <w:r>
-              <w:rPr>
-                <w:sz w:val="20"/>
-              </w:rPr>
-              <w:t>secara</w:t>
-            </w:r>
-            <w:proofErr w:type="spellEnd"/>
-            <w:r>
-              <w:rPr>
-                <w:sz w:val="20"/>
-              </w:rPr>
-              <w:t xml:space="preserve"> masa </w:t>
-            </w:r>
-            <w:proofErr w:type="spellStart"/>
-            <w:r>
-              <w:rPr>
-                <w:sz w:val="20"/>
-              </w:rPr>
-              <w:t>nyata</w:t>
-            </w:r>
-            <w:proofErr w:type="spellEnd"/>
-            <w:r>
-              <w:rPr>
-                <w:sz w:val="20"/>
-              </w:rPr>
-              <w:t xml:space="preserve"> </w:t>
-            </w:r>
-            <w:proofErr w:type="spellStart"/>
-            <w:r>
-              <w:rPr>
-                <w:sz w:val="20"/>
-              </w:rPr>
-              <w:t>apabila</w:t>
-            </w:r>
-            <w:proofErr w:type="spellEnd"/>
-            <w:r>
-              <w:rPr>
-                <w:sz w:val="20"/>
-              </w:rPr>
-              <w:t xml:space="preserve"> </w:t>
-            </w:r>
-            <w:proofErr w:type="spellStart"/>
-            <w:r>
-              <w:rPr>
-                <w:sz w:val="20"/>
-              </w:rPr>
-              <w:t>bahasa</w:t>
-            </w:r>
-            <w:proofErr w:type="spellEnd"/>
-            <w:r>
-              <w:rPr>
-                <w:sz w:val="20"/>
-              </w:rPr>
-              <w:t xml:space="preserve"> </w:t>
-            </w:r>
-            <w:proofErr w:type="spellStart"/>
-            <w:r>
-              <w:rPr>
-                <w:sz w:val="20"/>
-              </w:rPr>
-              <w:t>ditukar</w:t>
-            </w:r>
-            <w:proofErr w:type="spellEnd"/>
-            <w:r>
-              <w:rPr>
-                <w:sz w:val="20"/>
-              </w:rPr>
-              <w:t xml:space="preserve">. Carta </w:t>
-            </w:r>
-            <w:proofErr w:type="spellStart"/>
-            <w:r>
-              <w:rPr>
-                <w:sz w:val="20"/>
-              </w:rPr>
-              <w:t>akan</w:t>
-            </w:r>
-            <w:proofErr w:type="spellEnd"/>
-            <w:r>
-              <w:rPr>
-                <w:sz w:val="20"/>
-              </w:rPr>
-              <w:t xml:space="preserve"> </w:t>
-            </w:r>
-            <w:proofErr w:type="spellStart"/>
-            <w:r>
-              <w:rPr>
-                <w:sz w:val="20"/>
-              </w:rPr>
-              <w:t>dikemaskini</w:t>
-            </w:r>
-            <w:proofErr w:type="spellEnd"/>
-            <w:r>
-              <w:rPr>
-                <w:sz w:val="20"/>
-              </w:rPr>
-              <w:t xml:space="preserve"> </w:t>
-            </w:r>
-            <w:proofErr w:type="spellStart"/>
-            <w:r>
-              <w:rPr>
-                <w:sz w:val="20"/>
-              </w:rPr>
-              <w:t>hanya</w:t>
-            </w:r>
-            <w:proofErr w:type="spellEnd"/>
-            <w:r>
-              <w:rPr>
-                <w:sz w:val="20"/>
-              </w:rPr>
-              <w:t xml:space="preserve"> </w:t>
-            </w:r>
-            <w:proofErr w:type="spellStart"/>
-            <w:r>
-              <w:rPr>
-                <w:sz w:val="20"/>
-              </w:rPr>
-              <w:t>apabila</w:t>
-            </w:r>
-            <w:proofErr w:type="spellEnd"/>
-            <w:r>
-              <w:rPr>
-                <w:sz w:val="20"/>
-              </w:rPr>
-              <w:t xml:space="preserve"> </w:t>
-            </w:r>
-            <w:proofErr w:type="spellStart"/>
-            <w:r>
-              <w:rPr>
-                <w:sz w:val="20"/>
-              </w:rPr>
-              <w:t>papan</w:t>
-            </w:r>
-            <w:proofErr w:type="spellEnd"/>
-            <w:r>
-              <w:rPr>
-                <w:sz w:val="20"/>
-              </w:rPr>
-              <w:t xml:space="preserve"> </w:t>
-            </w:r>
-            <w:proofErr w:type="spellStart"/>
-            <w:r>
-              <w:rPr>
-                <w:sz w:val="20"/>
-              </w:rPr>
-              <w:t>pemuka</w:t>
-            </w:r>
-            <w:proofErr w:type="spellEnd"/>
-            <w:r>
-              <w:rPr>
-                <w:sz w:val="20"/>
-              </w:rPr>
-              <w:t xml:space="preserve"> </w:t>
-            </w:r>
-            <w:proofErr w:type="spellStart"/>
-            <w:r>
-              <w:rPr>
-                <w:sz w:val="20"/>
-              </w:rPr>
-              <w:t>dibuka</w:t>
-            </w:r>
-            <w:proofErr w:type="spellEnd"/>
-            <w:r>
-              <w:rPr>
-                <w:sz w:val="20"/>
-              </w:rPr>
-              <w:t xml:space="preserve"> </w:t>
-            </w:r>
-            <w:proofErr w:type="spellStart"/>
-            <w:r>
-              <w:rPr>
-                <w:sz w:val="20"/>
-              </w:rPr>
-              <w:t>semula</w:t>
-            </w:r>
-            <w:proofErr w:type="spellEnd"/>
-            <w:r>
-              <w:rPr>
-                <w:sz w:val="20"/>
-              </w:rPr>
-              <w:t>.</w:t>
+              <w:t>Telah diperbetulkan -- semua label UI kini terjemah sepenuhnya.</w:t>
+            </w:r>
+            <w:proofErr w:type="spellStart"/>
+            <w:r>
+              <w:rPr>
+                <w:sz w:val="20"/>
+              </w:rPr>
+              <w:t>Telah diperbetulkan -- semua label UI kini terjemah sepenuhnya.</w:t>
+            </w:r>
+            <w:proofErr w:type="spellEnd"/>
+            <w:r>
+              <w:rPr>
+                <w:sz w:val="20"/>
+              </w:rPr>
+              <w:t>Telah diperbetulkan -- semua label UI kini terjemah sepenuhnya.</w:t>
+            </w:r>
+            <w:proofErr w:type="spellStart"/>
+            <w:r>
+              <w:rPr>
+                <w:sz w:val="20"/>
+              </w:rPr>
+              <w:t>Telah diperbetulkan -- semua label UI kini terjemah sepenuhnya.</w:t>
+            </w:r>
+            <w:proofErr w:type="spellEnd"/>
+            <w:r>
+              <w:rPr>
+                <w:sz w:val="20"/>
+              </w:rPr>
+              <w:t>Telah diperbetulkan -- semua label UI kini terjemah sepenuhnya.</w:t>
+            </w:r>
+            <w:proofErr w:type="spellStart"/>
+            <w:r>
+              <w:rPr>
+                <w:sz w:val="20"/>
+              </w:rPr>
+              <w:t>Telah diperbetulkan -- semua label UI kini terjemah sepenuhnya.</w:t>
+            </w:r>
+            <w:proofErr w:type="spellEnd"/>
+            <w:r>
+              <w:rPr>
+                <w:sz w:val="20"/>
+              </w:rPr>
+              <w:t>Telah diperbetulkan -- semua label UI kini terjemah sepenuhnya.</w:t>
+            </w:r>
+            <w:proofErr w:type="spellStart"/>
+            <w:r>
+              <w:rPr>
+                <w:sz w:val="20"/>
+              </w:rPr>
+              <w:t>Telah diperbetulkan -- semua label UI kini terjemah sepenuhnya.</w:t>
+            </w:r>
+            <w:proofErr w:type="spellEnd"/>
+            <w:r>
+              <w:rPr>
+                <w:sz w:val="20"/>
+              </w:rPr>
+              <w:t>Telah diperbetulkan -- semua label UI kini terjemah sepenuhnya.</w:t>
+            </w:r>
+            <w:proofErr w:type="spellStart"/>
+            <w:r>
+              <w:rPr>
+                <w:sz w:val="20"/>
+              </w:rPr>
+              <w:t>Telah diperbetulkan -- semua label UI kini terjemah sepenuhnya.</w:t>
+            </w:r>
+            <w:proofErr w:type="spellEnd"/>
+            <w:r>
+              <w:rPr>
+                <w:sz w:val="20"/>
+              </w:rPr>
+              <w:t>Telah diperbetulkan -- semua label UI kini terjemah sepenuhnya.</w:t>
+            </w:r>
+            <w:proofErr w:type="spellStart"/>
+            <w:r>
+              <w:rPr>
+                <w:sz w:val="20"/>
+              </w:rPr>
+              <w:t>Telah diperbetulkan -- semua label UI kini terjemah sepenuhnya.</w:t>
+            </w:r>
+            <w:proofErr w:type="spellEnd"/>
+            <w:r>
+              <w:rPr>
+                <w:sz w:val="20"/>
+              </w:rPr>
+              <w:t>Telah diperbetulkan -- semua label UI kini terjemah sepenuhnya.</w:t>
+            </w:r>
+            <w:proofErr w:type="spellStart"/>
+            <w:r>
+              <w:rPr>
+                <w:sz w:val="20"/>
+              </w:rPr>
+              <w:t>Telah diperbetulkan -- semua label UI kini terjemah sepenuhnya.</w:t>
+            </w:r>
+            <w:proofErr w:type="spellEnd"/>
+            <w:r>
+              <w:rPr>
+                <w:sz w:val="20"/>
+              </w:rPr>
+              <w:t>Telah diperbetulkan -- semua label UI kini terjemah sepenuhnya.</w:t>
+            </w:r>
+            <w:proofErr w:type="spellStart"/>
+            <w:r>
+              <w:rPr>
+                <w:sz w:val="20"/>
+              </w:rPr>
+              <w:t>Telah diperbetulkan -- semua label UI kini terjemah sepenuhnya.</w:t>
+            </w:r>
+            <w:proofErr w:type="spellEnd"/>
+            <w:r>
+              <w:rPr>
+                <w:sz w:val="20"/>
+              </w:rPr>
+              <w:t>Telah diperbetulkan -- semua label UI kini terjemah sepenuhnya.</w:t>
+            </w:r>
+            <w:proofErr w:type="spellStart"/>
+            <w:r>
+              <w:rPr>
+                <w:sz w:val="20"/>
+              </w:rPr>
+              <w:t>Telah diperbetulkan -- semua label UI kini terjemah sepenuhnya.</w:t>
+            </w:r>
+            <w:proofErr w:type="spellEnd"/>
+            <w:r>
+              <w:rPr>
+                <w:sz w:val="20"/>
+              </w:rPr>
+              <w:t>Telah diperbetulkan -- semua label UI kini terjemah sepenuhnya.</w:t>
+            </w:r>
+            <w:proofErr w:type="spellStart"/>
+            <w:r>
+              <w:rPr>
+                <w:sz w:val="20"/>
+              </w:rPr>
+              <w:t>Telah diperbetulkan -- semua label UI kini terjemah sepenuhnya.</w:t>
+            </w:r>
+            <w:proofErr w:type="spellEnd"/>
+            <w:r>
+              <w:rPr>
+                <w:sz w:val="20"/>
+              </w:rPr>
+              <w:t>Telah diperbetulkan -- semua label UI kini terjemah sepenuhnya.</w:t>
+            </w:r>
+            <w:proofErr w:type="spellStart"/>
+            <w:r>
+              <w:rPr>
+                <w:sz w:val="20"/>
+              </w:rPr>
+              <w:t>Telah diperbetulkan -- semua label UI kini terjemah sepenuhnya.</w:t>
+            </w:r>
+            <w:proofErr w:type="spellEnd"/>
+            <w:r>
+              <w:rPr>
+                <w:sz w:val="20"/>
+              </w:rPr>
+              <w:t>Telah diperbetulkan -- semua label UI kini terjemah sepenuhnya.</w:t>
+            </w:r>
+            <w:proofErr w:type="spellStart"/>
+            <w:r>
+              <w:rPr>
+                <w:sz w:val="20"/>
+              </w:rPr>
+              <w:t>Telah diperbetulkan -- semua label UI kini terjemah sepenuhnya.</w:t>
+            </w:r>
+            <w:proofErr w:type="spellEnd"/>
+            <w:r>
+              <w:rPr>
+                <w:sz w:val="20"/>
+              </w:rPr>
+              <w:t>Telah diperbetulkan -- semua label UI kini terjemah sepenuhnya.</w:t>
+            </w:r>
+            <w:proofErr w:type="spellStart"/>
+            <w:r>
+              <w:rPr>
+                <w:sz w:val="20"/>
+              </w:rPr>
+              <w:t>Telah diperbetulkan -- semua label UI kini terjemah sepenuhnya.</w:t>
+            </w:r>
+            <w:proofErr w:type="spellEnd"/>
+            <w:r>
+              <w:rPr>
+                <w:sz w:val="20"/>
+              </w:rPr>
+              <w:t>Telah diperbetulkan -- semua label UI kini terjemah sepenuhnya.</w:t>
+            </w:r>
+            <w:proofErr w:type="spellStart"/>
+            <w:r>
+              <w:rPr>
+                <w:sz w:val="20"/>
+              </w:rPr>
+              <w:t>Telah diperbetulkan -- semua label UI kini terjemah sepenuhnya.</w:t>
+            </w:r>
+            <w:proofErr w:type="spellEnd"/>
+            <w:r>
+              <w:rPr>
+                <w:sz w:val="20"/>
+              </w:rPr>
+              <w:t>Telah diperbetulkan -- semua label UI kini terjemah sepenuhnya.</w:t>
+            </w:r>
+            <w:proofErr w:type="spellStart"/>
+            <w:r>
+              <w:rPr>
+                <w:sz w:val="20"/>
+              </w:rPr>
+              <w:t>Telah diperbetulkan -- semua label UI kini terjemah sepenuhnya.</w:t>
+            </w:r>
+            <w:proofErr w:type="spellEnd"/>
+            <w:r>
+              <w:rPr>
+                <w:sz w:val="20"/>
+              </w:rPr>
+              <w:t>Telah diperbetulkan -- semua label UI kini terjemah sepenuhnya.</w:t>
+            </w:r>
+            <w:proofErr w:type="spellStart"/>
+            <w:r>
+              <w:rPr>
+                <w:sz w:val="20"/>
+              </w:rPr>
+              <w:t>Telah diperbetulkan -- semua label UI kini terjemah sepenuhnya.</w:t>
+            </w:r>
+            <w:proofErr w:type="spellEnd"/>
+            <w:r>
+              <w:rPr>
+                <w:sz w:val="20"/>
+              </w:rPr>
+              <w:t>Telah diperbetulkan -- semua label UI kini terjemah sepenuhnya.</w:t>
+            </w:r>
+            <w:proofErr w:type="spellStart"/>
+            <w:r>
+              <w:rPr>
+                <w:sz w:val="20"/>
+              </w:rPr>
+              <w:t>Telah diperbetulkan -- semua label UI kini terjemah sepenuhnya.</w:t>
+            </w:r>
+            <w:proofErr w:type="spellEnd"/>
+            <w:r>
+              <w:rPr>
+                <w:sz w:val="20"/>
+              </w:rPr>
+              <w:t>Telah diperbetulkan -- semua label UI kini terjemah sepenuhnya.</w:t>
+            </w:r>
+            <w:proofErr w:type="spellStart"/>
+            <w:r>
+              <w:rPr>
+                <w:sz w:val="20"/>
+              </w:rPr>
+              <w:t>Telah diperbetulkan -- semua label UI kini terjemah sepenuhnya.</w:t>
+            </w:r>
+            <w:proofErr w:type="spellEnd"/>
+            <w:r>
+              <w:rPr>
+                <w:sz w:val="20"/>
+              </w:rPr>
+              <w:t>Telah diperbetulkan -- semua label UI kini terjemah sepenuhnya.</w:t>
             </w:r>
           </w:p>
         </w:tc>
@@ -14020,115 +14052,115 @@
       </w:pPr>
       <w:proofErr w:type="spellStart"/>
       <w:r>
-        <w:t>Tambah</w:t>
-      </w:r>
-      <w:proofErr w:type="spellEnd"/>
-      <w:r>
-        <w:t xml:space="preserve"> </w:t>
-      </w:r>
-      <w:proofErr w:type="spellStart"/>
-      <w:r>
-        <w:t>kemampuan</w:t>
-      </w:r>
-      <w:proofErr w:type="spellEnd"/>
-      <w:r>
-        <w:t xml:space="preserve"> </w:t>
-      </w:r>
-      <w:proofErr w:type="spellStart"/>
-      <w:r>
-        <w:t>untuk</w:t>
-      </w:r>
-      <w:proofErr w:type="spellEnd"/>
-      <w:r>
-        <w:t xml:space="preserve"> </w:t>
-      </w:r>
-      <w:proofErr w:type="spellStart"/>
-      <w:r>
-        <w:t>menterjemah</w:t>
-      </w:r>
-      <w:proofErr w:type="spellEnd"/>
-      <w:r>
-        <w:t xml:space="preserve"> </w:t>
-      </w:r>
-      <w:proofErr w:type="spellStart"/>
-      <w:r>
-        <w:t>dokumen</w:t>
-      </w:r>
-      <w:proofErr w:type="spellEnd"/>
-      <w:r>
-        <w:t xml:space="preserve"> </w:t>
-      </w:r>
-      <w:proofErr w:type="spellStart"/>
-      <w:r>
-        <w:t>rasmi</w:t>
-      </w:r>
-      <w:proofErr w:type="spellEnd"/>
-      <w:r>
-        <w:t xml:space="preserve"> </w:t>
-      </w:r>
-      <w:proofErr w:type="spellStart"/>
-      <w:r>
-        <w:t>antara</w:t>
-      </w:r>
-      <w:proofErr w:type="spellEnd"/>
-      <w:r>
-        <w:t xml:space="preserve"> Bahasa Malaysia dan English, </w:t>
-      </w:r>
-      <w:proofErr w:type="spellStart"/>
-      <w:r>
-        <w:t>berguna</w:t>
-      </w:r>
-      <w:proofErr w:type="spellEnd"/>
-      <w:r>
-        <w:t xml:space="preserve"> </w:t>
-      </w:r>
-      <w:proofErr w:type="spellStart"/>
-      <w:r>
-        <w:t>untuk</w:t>
-      </w:r>
-      <w:proofErr w:type="spellEnd"/>
-      <w:r>
-        <w:t xml:space="preserve"> </w:t>
-      </w:r>
-      <w:proofErr w:type="spellStart"/>
-      <w:r>
-        <w:t>surat</w:t>
-      </w:r>
-      <w:proofErr w:type="spellEnd"/>
-      <w:r>
-        <w:t xml:space="preserve"> </w:t>
-      </w:r>
-      <w:proofErr w:type="spellStart"/>
-      <w:r>
-        <w:t>rasmi</w:t>
-      </w:r>
-      <w:proofErr w:type="spellEnd"/>
-      <w:r>
-        <w:t xml:space="preserve"> </w:t>
-      </w:r>
-      <w:proofErr w:type="spellStart"/>
-      <w:r>
-        <w:t>kepada</w:t>
-      </w:r>
-      <w:proofErr w:type="spellEnd"/>
-      <w:r>
-        <w:t xml:space="preserve"> </w:t>
-      </w:r>
-      <w:proofErr w:type="spellStart"/>
-      <w:r>
-        <w:t>pihak</w:t>
-      </w:r>
-      <w:proofErr w:type="spellEnd"/>
-      <w:r>
-        <w:t xml:space="preserve"> </w:t>
-      </w:r>
-      <w:proofErr w:type="spellStart"/>
-      <w:r>
-        <w:t>antarabangsa</w:t>
-      </w:r>
-      <w:proofErr w:type="spellEnd"/>
-      <w:r>
-        <w:t>.</w:t>
+        <w:t>Togol bahasa BM/EN untuk antara muka telah dilaksanakan sepenuhnya dalam v7.0. Penterjemahan dokumen rasmi (kandungan surat/laporan) masih dalam cadangan jangka panjang.</w:t>
+      </w:r>
+      <w:proofErr w:type="spellEnd"/>
+      <w:r>
+        <w:t>Togol bahasa BM/EN untuk antara muka telah dilaksanakan sepenuhnya dalam v7.0. Penterjemahan dokumen rasmi (kandungan surat/laporan) masih dalam cadangan jangka panjang.</w:t>
+      </w:r>
+      <w:proofErr w:type="spellStart"/>
+      <w:r>
+        <w:t>Togol bahasa BM/EN untuk antara muka telah dilaksanakan sepenuhnya dalam v7.0. Penterjemahan dokumen rasmi (kandungan surat/laporan) masih dalam cadangan jangka panjang.</w:t>
+      </w:r>
+      <w:proofErr w:type="spellEnd"/>
+      <w:r>
+        <w:t>Togol bahasa BM/EN untuk antara muka telah dilaksanakan sepenuhnya dalam v7.0. Penterjemahan dokumen rasmi (kandungan surat/laporan) masih dalam cadangan jangka panjang.</w:t>
+      </w:r>
+      <w:proofErr w:type="spellStart"/>
+      <w:r>
+        <w:t>Togol bahasa BM/EN untuk antara muka telah dilaksanakan sepenuhnya dalam v7.0. Penterjemahan dokumen rasmi (kandungan surat/laporan) masih dalam cadangan jangka panjang.</w:t>
+      </w:r>
+      <w:proofErr w:type="spellEnd"/>
+      <w:r>
+        <w:t>Togol bahasa BM/EN untuk antara muka telah dilaksanakan sepenuhnya dalam v7.0. Penterjemahan dokumen rasmi (kandungan surat/laporan) masih dalam cadangan jangka panjang.</w:t>
+      </w:r>
+      <w:proofErr w:type="spellStart"/>
+      <w:r>
+        <w:t>Togol bahasa BM/EN untuk antara muka telah dilaksanakan sepenuhnya dalam v7.0. Penterjemahan dokumen rasmi (kandungan surat/laporan) masih dalam cadangan jangka panjang.</w:t>
+      </w:r>
+      <w:proofErr w:type="spellEnd"/>
+      <w:r>
+        <w:t>Togol bahasa BM/EN untuk antara muka telah dilaksanakan sepenuhnya dalam v7.0. Penterjemahan dokumen rasmi (kandungan surat/laporan) masih dalam cadangan jangka panjang.</w:t>
+      </w:r>
+      <w:proofErr w:type="spellStart"/>
+      <w:r>
+        <w:t>Togol bahasa BM/EN untuk antara muka telah dilaksanakan sepenuhnya dalam v7.0. Penterjemahan dokumen rasmi (kandungan surat/laporan) masih dalam cadangan jangka panjang.</w:t>
+      </w:r>
+      <w:proofErr w:type="spellEnd"/>
+      <w:r>
+        <w:t>Togol bahasa BM/EN untuk antara muka telah dilaksanakan sepenuhnya dalam v7.0. Penterjemahan dokumen rasmi (kandungan surat/laporan) masih dalam cadangan jangka panjang.</w:t>
+      </w:r>
+      <w:proofErr w:type="spellStart"/>
+      <w:r>
+        <w:t>Togol bahasa BM/EN untuk antara muka telah dilaksanakan sepenuhnya dalam v7.0. Penterjemahan dokumen rasmi (kandungan surat/laporan) masih dalam cadangan jangka panjang.</w:t>
+      </w:r>
+      <w:proofErr w:type="spellEnd"/>
+      <w:r>
+        <w:t>Togol bahasa BM/EN untuk antara muka telah dilaksanakan sepenuhnya dalam v7.0. Penterjemahan dokumen rasmi (kandungan surat/laporan) masih dalam cadangan jangka panjang.</w:t>
+      </w:r>
+      <w:proofErr w:type="spellStart"/>
+      <w:r>
+        <w:t>Togol bahasa BM/EN untuk antara muka telah dilaksanakan sepenuhnya dalam v7.0. Penterjemahan dokumen rasmi (kandungan surat/laporan) masih dalam cadangan jangka panjang.</w:t>
+      </w:r>
+      <w:proofErr w:type="spellEnd"/>
+      <w:r>
+        <w:t>Togol bahasa BM/EN untuk antara muka telah dilaksanakan sepenuhnya dalam v7.0. Penterjemahan dokumen rasmi (kandungan surat/laporan) masih dalam cadangan jangka panjang.</w:t>
+      </w:r>
+      <w:proofErr w:type="spellStart"/>
+      <w:r>
+        <w:t>Togol bahasa BM/EN untuk antara muka telah dilaksanakan sepenuhnya dalam v7.0. Penterjemahan dokumen rasmi (kandungan surat/laporan) masih dalam cadangan jangka panjang.</w:t>
+      </w:r>
+      <w:proofErr w:type="spellEnd"/>
+      <w:r>
+        <w:t>Togol bahasa BM/EN untuk antara muka telah dilaksanakan sepenuhnya dalam v7.0. Penterjemahan dokumen rasmi (kandungan surat/laporan) masih dalam cadangan jangka panjang.</w:t>
+      </w:r>
+      <w:proofErr w:type="spellStart"/>
+      <w:r>
+        <w:t>Togol bahasa BM/EN untuk antara muka telah dilaksanakan sepenuhnya dalam v7.0. Penterjemahan dokumen rasmi (kandungan surat/laporan) masih dalam cadangan jangka panjang.</w:t>
+      </w:r>
+      <w:proofErr w:type="spellEnd"/>
+      <w:r>
+        <w:t>Togol bahasa BM/EN untuk antara muka telah dilaksanakan sepenuhnya dalam v7.0. Penterjemahan dokumen rasmi (kandungan surat/laporan) masih dalam cadangan jangka panjang.</w:t>
+      </w:r>
+      <w:proofErr w:type="spellStart"/>
+      <w:r>
+        <w:t>Togol bahasa BM/EN untuk antara muka telah dilaksanakan sepenuhnya dalam v7.0. Penterjemahan dokumen rasmi (kandungan surat/laporan) masih dalam cadangan jangka panjang.</w:t>
+      </w:r>
+      <w:proofErr w:type="spellEnd"/>
+      <w:r>
+        <w:t>Togol bahasa BM/EN untuk antara muka telah dilaksanakan sepenuhnya dalam v7.0. Penterjemahan dokumen rasmi (kandungan surat/laporan) masih dalam cadangan jangka panjang.</w:t>
+      </w:r>
+      <w:proofErr w:type="spellStart"/>
+      <w:r>
+        <w:t>Togol bahasa BM/EN untuk antara muka telah dilaksanakan sepenuhnya dalam v7.0. Penterjemahan dokumen rasmi (kandungan surat/laporan) masih dalam cadangan jangka panjang.</w:t>
+      </w:r>
+      <w:proofErr w:type="spellEnd"/>
+      <w:r>
+        <w:t>Togol bahasa BM/EN untuk antara muka telah dilaksanakan sepenuhnya dalam v7.0. Penterjemahan dokumen rasmi (kandungan surat/laporan) masih dalam cadangan jangka panjang.</w:t>
+      </w:r>
+      <w:proofErr w:type="spellStart"/>
+      <w:r>
+        <w:t>Togol bahasa BM/EN untuk antara muka telah dilaksanakan sepenuhnya dalam v7.0. Penterjemahan dokumen rasmi (kandungan surat/laporan) masih dalam cadangan jangka panjang.</w:t>
+      </w:r>
+      <w:proofErr w:type="spellEnd"/>
+      <w:r>
+        <w:t>Togol bahasa BM/EN untuk antara muka telah dilaksanakan sepenuhnya dalam v7.0. Penterjemahan dokumen rasmi (kandungan surat/laporan) masih dalam cadangan jangka panjang.</w:t>
+      </w:r>
+      <w:proofErr w:type="spellStart"/>
+      <w:r>
+        <w:t>Togol bahasa BM/EN untuk antara muka telah dilaksanakan sepenuhnya dalam v7.0. Penterjemahan dokumen rasmi (kandungan surat/laporan) masih dalam cadangan jangka panjang.</w:t>
+      </w:r>
+      <w:proofErr w:type="spellEnd"/>
+      <w:r>
+        <w:t>Togol bahasa BM/EN untuk antara muka telah dilaksanakan sepenuhnya dalam v7.0. Penterjemahan dokumen rasmi (kandungan surat/laporan) masih dalam cadangan jangka panjang.</w:t>
+      </w:r>
+      <w:proofErr w:type="spellStart"/>
+      <w:r>
+        <w:t>Togol bahasa BM/EN untuk antara muka telah dilaksanakan sepenuhnya dalam v7.0. Penterjemahan dokumen rasmi (kandungan surat/laporan) masih dalam cadangan jangka panjang.</w:t>
+      </w:r>
+      <w:proofErr w:type="spellEnd"/>
+      <w:r>
+        <w:t>Togol bahasa BM/EN untuk antara muka telah dilaksanakan sepenuhnya dalam v7.0. Penterjemahan dokumen rasmi (kandungan surat/laporan) masih dalam cadangan jangka panjang.</w:t>
       </w:r>
     </w:p>
     <w:p>
@@ -16475,6 +16507,38 @@
       </w:r>
     </w:p>
     <w:p>
+      <w:r>
+        <w:rPr>
+          <w:b w:val="0"/>
+        </w:rPr>
+        <w:t>Eksport Excel: Selepas analisis selesai, klik ikon Excel dalam panel WORKSPACE untuk mengeksport data ke fail .xlsx.</w:t>
+      </w:r>
+    </w:p>
+    <w:p>
+      <w:r>
+        <w:rPr>
+          <w:b w:val="0"/>
+        </w:rPr>
+        <w:t>Perbandingan Dua Fail: Untuk membandingkan dua set data, muat naik fail pertama, kemudian muat naik fail kedua. Sistem akan mengesan kedua-dua fail dan tanya sama ada anda ingin membandingkannya.</w:t>
+      </w:r>
+    </w:p>
+    <w:p>
+      <w:r>
+        <w:rPr>
+          <w:b w:val="0"/>
+        </w:rPr>
+        <w:t>Template Pendidikan (1-Klik): Klik ikon templat untuk akses analisis siap guna -- Keputusan Peperiksaan dan Kehadiran Murid. Sistem akan menjana analisis lengkap secara automatik.</w:t>
+      </w:r>
+    </w:p>
+    <w:p>
+      <w:r>
+        <w:rPr>
+          <w:b w:val="0"/>
+        </w:rPr>
+        <w:t>Soal Jawab Carta: Selepas carta dijana, anda boleh terus bertanya tentang carta tersebut. Contoh: "Sekolah mana yang paling rendah dalam carta ini?" -- sistem akan menjawab berdasarkan data carta.</w:t>
+      </w:r>
+    </w:p>
+    <w:p>
       <w:pPr>
         <w:spacing w:before="200" w:after="80"/>
       </w:pPr>
@@ -16858,6 +16922,14 @@
       </w:r>
     </w:p>
     <w:p>
+      <w:r>
+        <w:rPr>
+          <w:b w:val="0"/>
+        </w:rPr>
+        <w:t>9.  Hantar Emel: Klik butang "Hantar Emel" dalam panel WORKSPACE untuk menghantar dokumen terus kepada penerima. Masukkan alamat emel dan klik Hantar. (Memerlukan konfigurasi SMTP oleh pentadbir sistem.)</w:t>
+      </w:r>
+    </w:p>
+    <w:p>
       <w:pPr>
         <w:spacing w:before="200" w:after="80"/>
         <w:rPr>
@@ -17293,12 +17365,20 @@
       </w:r>
     </w:p>
     <w:p>
+      <w:r>
+        <w:rPr>
+          <w:b w:val="0"/>
+        </w:rPr>
+        <w:t>7.  Navigasi Pantas Antara Agen: Dalam respons KPM Support, terdapat butang navigasi pantas (pill) yang membolehkan anda beralih terus ke agen lain (Analisis Data, Penjana Surat, Penjana Laporan, Semakan Dokumen) tanpa perlu kembali ke halaman utama.</w:t>
+      </w:r>
+    </w:p>
+    <w:p>
       <w:pPr>
         <w:spacing w:before="20" w:after="80" w:line="260" w:lineRule="exact"/>
         <w:jc w:val="both"/>
       </w:pPr>
       <w:r>
-        <w:t>Sistem yang disokong: EMIS, APDM, DTPCare, SK@S, Polisi &amp; Pekeliling KPM</w:t>
+        <w:t>Sistem yang disokong: EMIS, APDM, DTPCare, SK@S, DELIMa, Polisi &amp; Pekeliling KPM</w:t>
       </w:r>
     </w:p>
     <w:p>
@@ -17557,6 +17637,78 @@
       </w:r>
     </w:p>
     <w:p>
+      <w:r>
+        <w:rPr>
+          <w:b w:val="0"/>
+        </w:rPr>
+      </w:r>
+    </w:p>
+    <w:p>
+      <w:r>
+        <w:rPr>
+          <w:b/>
+          <w:sz w:val="22"/>
+        </w:rPr>
+        <w:t>Mod Gelap/Cerah (Dark/Light Mode)</w:t>
+      </w:r>
+    </w:p>
+    <w:p>
+      <w:r>
+        <w:rPr>
+          <w:b w:val="0"/>
+        </w:rPr>
+        <w:t>1.  Cari ikon bulan/matahari di bar navigasi atas.</w:t>
+      </w:r>
+    </w:p>
+    <w:p>
+      <w:r>
+        <w:rPr>
+          <w:b w:val="0"/>
+        </w:rPr>
+        <w:t>2.  Klik untuk bertukar antara mod gelap (dark) dan mod cerah (light).</w:t>
+      </w:r>
+    </w:p>
+    <w:p>
+      <w:r>
+        <w:rPr>
+          <w:b w:val="0"/>
+        </w:rPr>
+        <w:t>3.  Pilihan tema disimpan secara automatik untuk sesi berikutnya.</w:t>
+      </w:r>
+    </w:p>
+    <w:p>
+      <w:r>
+        <w:rPr>
+          <w:b w:val="0"/>
+        </w:rPr>
+      </w:r>
+    </w:p>
+    <w:p>
+      <w:r>
+        <w:rPr>
+          <w:b/>
+          <w:sz w:val="22"/>
+        </w:rPr>
+        <w:t>Pelarasan Saiz Fon</w:t>
+      </w:r>
+    </w:p>
+    <w:p>
+      <w:r>
+        <w:rPr>
+          <w:b w:val="0"/>
+        </w:rPr>
+        <w:t>1.  Cari butang A+ dan A- di bar navigasi atas.</w:t>
+      </w:r>
+    </w:p>
+    <w:p>
+      <w:r>
+        <w:rPr>
+          <w:b w:val="0"/>
+        </w:rPr>
+        <w:t>2.  Klik A+ untuk membesarkan teks atau A- untuk mengecilkan teks dalam ruang perbualan.</w:t>
+      </w:r>
+    </w:p>
+    <w:p>
       <w:pPr>
         <w:spacing w:before="20" w:after="40"/>
         <w:ind w:left="454" w:hanging="283"/>
@@ -17802,6 +17954,54 @@
       </w:r>
     </w:p>
     <w:p>
+      <w:r>
+        <w:rPr>
+          <w:b w:val="0"/>
+        </w:rPr>
+      </w:r>
+    </w:p>
+    <w:p>
+      <w:r>
+        <w:rPr>
+          <w:b/>
+          <w:sz w:val="22"/>
+        </w:rPr>
+        <w:t>S: Bagaimana untuk tukar ke mod gelap (dark mode)?</w:t>
+      </w:r>
+    </w:p>
+    <w:p>
+      <w:r>
+        <w:rPr>
+          <w:b w:val="0"/>
+        </w:rPr>
+        <w:t>J: Klik ikon bulan/matahari di sudut kanan atas antara muka. Tema akan bertukar serta-merta dan pilihan anda disimpan untuk sesi berikutnya.</w:t>
+      </w:r>
+    </w:p>
+    <w:p>
+      <w:r>
+        <w:rPr>
+          <w:b w:val="0"/>
+        </w:rPr>
+      </w:r>
+    </w:p>
+    <w:p>
+      <w:r>
+        <w:rPr>
+          <w:b/>
+          <w:sz w:val="22"/>
+        </w:rPr>
+        <w:t>S: Bolehkah saya bandingkan dua fail data serentak?</w:t>
+      </w:r>
+    </w:p>
+    <w:p>
+      <w:r>
+        <w:rPr>
+          <w:b w:val="0"/>
+        </w:rPr>
+        <w:t>J: Ya. Dalam modul Data Analysis, muat naik fail pertama kemudian muat naik fail kedua. Sistem akan mengesan kedua-dua fail dan tanya sama ada anda mahu membandingkannya secara terus.</w:t>
+      </w:r>
+    </w:p>
+    <w:p>
       <w:pPr>
         <w:spacing w:after="80" w:line="260" w:lineRule="exact"/>
       </w:pPr>
@@ -17910,6 +18110,46 @@
           <w:sz w:val="22"/>
         </w:rPr>
         <w:t>6.  Penambahbaikan UI/UX -- Skala fon diselaraskan, penapis sejarah sesi ditambah baik, animasi mesej diperhalus, dan kontras warna mod cerah (light mode) diperbetulkan pada papan pemuka analitik dan panel profil.</w:t>
+      </w:r>
+    </w:p>
+    <w:p>
+      <w:r>
+        <w:rPr>
+          <w:b w:val="0"/>
+        </w:rPr>
+        <w:t>7.  Mod Gelap/Cerah (Dark/Light Mode) -- Pengguna boleh bertukar antara tema gelap dan cerah. Semua komponen antara muka -- papan pemuka, panel profil, carta analitik, dan semua agen -- menyokong kedua-dua tema dengan kontras warna yang betul.</w:t>
+      </w:r>
+    </w:p>
+    <w:p>
+      <w:r>
+        <w:rPr>
+          <w:b w:val="0"/>
+        </w:rPr>
+        <w:t>8.  Perbandingan Dua Fail Data -- Modul Data Analysis kini menyokong muat naik dan perbandingan dua fail CSV/Excel serentak.</w:t>
+      </w:r>
+    </w:p>
+    <w:p>
+      <w:r>
+        <w:rPr>
+          <w:b w:val="0"/>
+        </w:rPr>
+        <w:t>9.  Eksport Excel -- Data yang dianalisis boleh dieksport terus ke fail Microsoft Excel (.xlsx) dari panel WORKSPACE.</w:t>
+      </w:r>
+    </w:p>
+    <w:p>
+      <w:r>
+        <w:rPr>
+          <w:b w:val="0"/>
+        </w:rPr>
+        <w:t>10. Templat Pendidikan 1-Klik -- Dua templat analisis siap guna ditambah: Keputusan Peperiksaan dan Kehadiran Murid, menjana analisis lengkap secara automatik.</w:t>
+      </w:r>
+    </w:p>
+    <w:p>
+      <w:r>
+        <w:rPr>
+          <w:b w:val="0"/>
+        </w:rPr>
+        <w:t>11. Carta Interaktif &amp; Soal Jawab Carta -- Carta yang dijana kini lebih interaktif. Pengguna boleh bertanya soalan lanjut berdasarkan carta yang telah dipaparkan.</w:t>
       </w:r>
     </w:p>
     <w:p>

</xml_diff>